<commit_message>
upd Class diagram vfinale
</commit_message>
<xml_diff>
--- a/Nhom10_REPORT_ApplicationDevelopment[V2].docx
+++ b/Nhom10_REPORT_ApplicationDevelopment[V2].docx
@@ -16842,10 +16842,10 @@
     <w:p>
       <w:r>
         <w:drawing>
-          <wp:inline distT="0" distB="0" distL="0" distR="0" wp14:anchorId="2D2F7B3E" wp14:editId="07C4EAA8">
-            <wp:extent cx="5580380" cy="2706370"/>
+          <wp:inline distT="0" distB="0" distL="0" distR="0" wp14:anchorId="1E7AE9C6" wp14:editId="43952600">
+            <wp:extent cx="5580380" cy="2611755"/>
             <wp:effectExtent l="0" t="0" r="1270" b="0"/>
-            <wp:docPr id="626553254" name="Picture 1"/>
+            <wp:docPr id="1773277357" name="Picture 1"/>
             <wp:cNvGraphicFramePr>
               <a:graphicFrameLocks xmlns:a="http://schemas.openxmlformats.org/drawingml/2006/main" noChangeAspect="1"/>
             </wp:cNvGraphicFramePr>
@@ -16853,7 +16853,7 @@
               <a:graphicData uri="http://schemas.openxmlformats.org/drawingml/2006/picture">
                 <pic:pic xmlns:pic="http://schemas.openxmlformats.org/drawingml/2006/picture">
                   <pic:nvPicPr>
-                    <pic:cNvPr id="626553254" name=""/>
+                    <pic:cNvPr id="1773277357" name=""/>
                     <pic:cNvPicPr/>
                   </pic:nvPicPr>
                   <pic:blipFill>
@@ -16865,7 +16865,7 @@
                   <pic:spPr>
                     <a:xfrm>
                       <a:off x="0" y="0"/>
-                      <a:ext cx="5580380" cy="2706370"/>
+                      <a:ext cx="5580380" cy="2611755"/>
                     </a:xfrm>
                     <a:prstGeom prst="rect">
                       <a:avLst/>
@@ -19654,7 +19654,7 @@
           <w:noProof/>
         </w:rPr>
         <w:drawing>
-          <wp:inline distT="0" distB="0" distL="0" distR="0" wp14:anchorId="7BB8721A" wp14:editId="2A29A840">
+          <wp:inline distT="0" distB="0" distL="0" distR="0" wp14:anchorId="7BB8721A" wp14:editId="5CE0A42A">
             <wp:extent cx="1639614" cy="589327"/>
             <wp:effectExtent l="0" t="0" r="0" b="0"/>
             <wp:docPr id="972141918" name="Picture 1"/>
@@ -21819,7 +21819,7 @@
           <w:noProof/>
         </w:rPr>
         <w:drawing>
-          <wp:inline distT="0" distB="0" distL="0" distR="0" wp14:anchorId="5CE39CCD" wp14:editId="286AF444">
+          <wp:inline distT="0" distB="0" distL="0" distR="0" wp14:anchorId="5CE39CCD" wp14:editId="4BDF9EEC">
             <wp:extent cx="5580380" cy="3687445"/>
             <wp:effectExtent l="0" t="0" r="0" b="0"/>
             <wp:docPr id="2" name="Picture 2" descr="A close-up of a document&#10;&#10;Description automatically generated"/>

</xml_diff>